<commit_message>
edited on july 2
</commit_message>
<xml_diff>
--- a/src/f1tenth_race_stack/Documents/F1TENTH_Race_Stack_IEEE.docx
+++ b/src/f1tenth_race_stack/Documents/F1TENTH_Race_Stack_IEEE.docx
@@ -1783,6 +1783,411 @@
     </w:p>
     <w:p>
       <w:pPr>
+        <w:pStyle w:val="Heading2"/>
+      </w:pPr>
+      <w:r>
+        <w:rPr>
+          <w:rFonts w:ascii="Times New Roman" w:cs="Times New Roman" w:eastAsia="Times New Roman" w:hAnsi="Times New Roman"/>
+          <w:b/>
+          <w:bCs/>
+          <w:i/>
+          <w:iCs/>
+          <w:sz w:val="20"/>
+          <w:szCs w:val="20"/>
+        </w:rPr>
+        <w:t xml:space="preserve">D. Two-Package Architecture</w:t>
+      </w:r>
+    </w:p>
+    <w:p>
+      <w:pPr>
+        <w:spacing w:after="120" w:line="264"/>
+        <w:jc w:val="both"/>
+      </w:pPr>
+      <w:r>
+        <w:rPr>
+          <w:rFonts w:ascii="Times New Roman" w:cs="Times New Roman" w:eastAsia="Times New Roman" w:hAnsi="Times New Roman"/>
+          <w:sz w:val="20"/>
+          <w:szCs w:val="20"/>
+        </w:rPr>
+        <w:t xml:space="preserve">The workspace is organized into two ROS 2 packages with a clean separation of concerns, summarized in Table I-B. The f1tenth_gym_ros package is the simulator: it emulates vehicle physics, track walls, LiDAR returns, and odometry, and is never deployed to physical hardware. The f1tenth_race_stack package is the “brain”—Pure Pursuit, Follow-the-Gap, MPPI, and the race state machine—and is identical whether it is running against the simulator or the real car, since it depends only on the /scan and /ego_racecar/odom topics and publishes exclusively to /drive. The source of those topics is fully transparent to the brain package, which is what allows algorithms to be developed and validated in simulation before being deployed unmodified to hardware.</w:t>
+      </w:r>
+    </w:p>
+    <w:tbl>
+      <w:tblPr>
+        <w:tblW w:type="dxa" w:w="4824"/>
+        <w:tblBorders>
+          <w:top w:val="single" w:color="auto" w:sz="4"/>
+          <w:left w:val="single" w:color="auto" w:sz="4"/>
+          <w:bottom w:val="single" w:color="auto" w:sz="4"/>
+          <w:right w:val="single" w:color="auto" w:sz="4"/>
+          <w:insideH w:val="single" w:color="auto" w:sz="4"/>
+          <w:insideV w:val="single" w:color="auto" w:sz="4"/>
+        </w:tblBorders>
+      </w:tblPr>
+      <w:tblGrid>
+        <w:gridCol w:w="1700"/>
+        <w:gridCol w:w="2100"/>
+        <w:gridCol w:w="1024"/>
+      </w:tblGrid>
+      <w:tr>
+        <w:tc>
+          <w:tcPr>
+            <w:tcW w:type="dxa" w:w="1700"/>
+            <w:tcBorders>
+              <w:top w:val="single" w:color="999999" w:sz="2"/>
+              <w:left w:val="single" w:color="999999" w:sz="2"/>
+              <w:bottom w:val="single" w:color="999999" w:sz="2"/>
+              <w:right w:val="single" w:color="999999" w:sz="2"/>
+            </w:tcBorders>
+            <w:shd w:fill="D9D9D9" w:val="clear"/>
+            <w:tcMar>
+              <w:top w:type="dxa" w:w="60"/>
+              <w:left w:type="dxa" w:w="100"/>
+              <w:bottom w:type="dxa" w:w="60"/>
+              <w:right w:type="dxa" w:w="100"/>
+            </w:tcMar>
+          </w:tcPr>
+          <w:p>
+            <w:pPr>
+              <w:jc w:val="left"/>
+            </w:pPr>
+            <w:r>
+              <w:rPr>
+                <w:rFonts w:ascii="Times New Roman" w:cs="Times New Roman" w:eastAsia="Times New Roman" w:hAnsi="Times New Roman"/>
+                <w:b/>
+                <w:bCs/>
+                <w:sz w:val="18"/>
+                <w:szCs w:val="18"/>
+              </w:rPr>
+              <w:t xml:space="preserve">Package</w:t>
+            </w:r>
+          </w:p>
+        </w:tc>
+        <w:tc>
+          <w:tcPr>
+            <w:tcW w:type="dxa" w:w="2100"/>
+            <w:tcBorders>
+              <w:top w:val="single" w:color="999999" w:sz="2"/>
+              <w:left w:val="single" w:color="999999" w:sz="2"/>
+              <w:bottom w:val="single" w:color="999999" w:sz="2"/>
+              <w:right w:val="single" w:color="999999" w:sz="2"/>
+            </w:tcBorders>
+            <w:shd w:fill="D9D9D9" w:val="clear"/>
+            <w:tcMar>
+              <w:top w:type="dxa" w:w="60"/>
+              <w:left w:type="dxa" w:w="100"/>
+              <w:bottom w:type="dxa" w:w="60"/>
+              <w:right w:type="dxa" w:w="100"/>
+            </w:tcMar>
+          </w:tcPr>
+          <w:p>
+            <w:pPr>
+              <w:jc w:val="left"/>
+            </w:pPr>
+            <w:r>
+              <w:rPr>
+                <w:rFonts w:ascii="Times New Roman" w:cs="Times New Roman" w:eastAsia="Times New Roman" w:hAnsi="Times New Roman"/>
+                <w:b/>
+                <w:bCs/>
+                <w:sz w:val="18"/>
+                <w:szCs w:val="18"/>
+              </w:rPr>
+              <w:t xml:space="preserve">Role</w:t>
+            </w:r>
+          </w:p>
+        </w:tc>
+        <w:tc>
+          <w:tcPr>
+            <w:tcW w:type="dxa" w:w="1024"/>
+            <w:tcBorders>
+              <w:top w:val="single" w:color="999999" w:sz="2"/>
+              <w:left w:val="single" w:color="999999" w:sz="2"/>
+              <w:bottom w:val="single" w:color="999999" w:sz="2"/>
+              <w:right w:val="single" w:color="999999" w:sz="2"/>
+            </w:tcBorders>
+            <w:shd w:fill="D9D9D9" w:val="clear"/>
+            <w:tcMar>
+              <w:top w:type="dxa" w:w="60"/>
+              <w:left w:type="dxa" w:w="100"/>
+              <w:bottom w:type="dxa" w:w="60"/>
+              <w:right w:type="dxa" w:w="100"/>
+            </w:tcMar>
+          </w:tcPr>
+          <w:p>
+            <w:pPr>
+              <w:jc w:val="left"/>
+            </w:pPr>
+            <w:r>
+              <w:rPr>
+                <w:rFonts w:ascii="Times New Roman" w:cs="Times New Roman" w:eastAsia="Times New Roman" w:hAnsi="Times New Roman"/>
+                <w:b/>
+                <w:bCs/>
+                <w:sz w:val="18"/>
+                <w:szCs w:val="18"/>
+              </w:rPr>
+              <w:t xml:space="preserve">Runs on real car?</w:t>
+            </w:r>
+          </w:p>
+        </w:tc>
+      </w:tr>
+      <w:tr>
+        <w:tc>
+          <w:tcPr>
+            <w:tcW w:type="dxa" w:w="1700"/>
+            <w:tcBorders>
+              <w:top w:val="single" w:color="999999" w:sz="2"/>
+              <w:left w:val="single" w:color="999999" w:sz="2"/>
+              <w:bottom w:val="single" w:color="999999" w:sz="2"/>
+              <w:right w:val="single" w:color="999999" w:sz="2"/>
+            </w:tcBorders>
+            <w:tcMar>
+              <w:top w:type="dxa" w:w="60"/>
+              <w:left w:type="dxa" w:w="100"/>
+              <w:bottom w:type="dxa" w:w="60"/>
+              <w:right w:type="dxa" w:w="100"/>
+            </w:tcMar>
+          </w:tcPr>
+          <w:p>
+            <w:pPr>
+              <w:jc w:val="left"/>
+            </w:pPr>
+            <w:r>
+              <w:rPr>
+                <w:rFonts w:ascii="Times New Roman" w:cs="Times New Roman" w:eastAsia="Times New Roman" w:hAnsi="Times New Roman"/>
+                <w:sz w:val="18"/>
+                <w:szCs w:val="18"/>
+              </w:rPr>
+              <w:t xml:space="preserve">f1tenth_gym_ros</w:t>
+            </w:r>
+          </w:p>
+        </w:tc>
+        <w:tc>
+          <w:tcPr>
+            <w:tcW w:type="dxa" w:w="2100"/>
+            <w:tcBorders>
+              <w:top w:val="single" w:color="999999" w:sz="2"/>
+              <w:left w:val="single" w:color="999999" w:sz="2"/>
+              <w:bottom w:val="single" w:color="999999" w:sz="2"/>
+              <w:right w:val="single" w:color="999999" w:sz="2"/>
+            </w:tcBorders>
+            <w:tcMar>
+              <w:top w:type="dxa" w:w="60"/>
+              <w:left w:type="dxa" w:w="100"/>
+              <w:bottom w:type="dxa" w:w="60"/>
+              <w:right w:type="dxa" w:w="100"/>
+            </w:tcMar>
+          </w:tcPr>
+          <w:p>
+            <w:pPr>
+              <w:jc w:val="left"/>
+            </w:pPr>
+            <w:r>
+              <w:rPr>
+                <w:rFonts w:ascii="Times New Roman" w:cs="Times New Roman" w:eastAsia="Times New Roman" w:hAnsi="Times New Roman"/>
+                <w:sz w:val="18"/>
+                <w:szCs w:val="18"/>
+              </w:rPr>
+              <w:t xml:space="preserve">Simulator: physics, walls, LiDAR, odometry</w:t>
+            </w:r>
+          </w:p>
+        </w:tc>
+        <w:tc>
+          <w:tcPr>
+            <w:tcW w:type="dxa" w:w="1024"/>
+            <w:tcBorders>
+              <w:top w:val="single" w:color="999999" w:sz="2"/>
+              <w:left w:val="single" w:color="999999" w:sz="2"/>
+              <w:bottom w:val="single" w:color="999999" w:sz="2"/>
+              <w:right w:val="single" w:color="999999" w:sz="2"/>
+            </w:tcBorders>
+            <w:tcMar>
+              <w:top w:type="dxa" w:w="60"/>
+              <w:left w:type="dxa" w:w="100"/>
+              <w:bottom w:type="dxa" w:w="60"/>
+              <w:right w:type="dxa" w:w="100"/>
+            </w:tcMar>
+          </w:tcPr>
+          <w:p>
+            <w:pPr>
+              <w:jc w:val="left"/>
+            </w:pPr>
+            <w:r>
+              <w:rPr>
+                <w:rFonts w:ascii="Times New Roman" w:cs="Times New Roman" w:eastAsia="Times New Roman" w:hAnsi="Times New Roman"/>
+                <w:sz w:val="18"/>
+                <w:szCs w:val="18"/>
+              </w:rPr>
+              <w:t xml:space="preserve">No</w:t>
+            </w:r>
+          </w:p>
+        </w:tc>
+      </w:tr>
+      <w:tr>
+        <w:tc>
+          <w:tcPr>
+            <w:tcW w:type="dxa" w:w="1700"/>
+            <w:tcBorders>
+              <w:top w:val="single" w:color="999999" w:sz="2"/>
+              <w:left w:val="single" w:color="999999" w:sz="2"/>
+              <w:bottom w:val="single" w:color="999999" w:sz="2"/>
+              <w:right w:val="single" w:color="999999" w:sz="2"/>
+            </w:tcBorders>
+            <w:tcMar>
+              <w:top w:type="dxa" w:w="60"/>
+              <w:left w:type="dxa" w:w="100"/>
+              <w:bottom w:type="dxa" w:w="60"/>
+              <w:right w:type="dxa" w:w="100"/>
+            </w:tcMar>
+          </w:tcPr>
+          <w:p>
+            <w:pPr>
+              <w:jc w:val="left"/>
+            </w:pPr>
+            <w:r>
+              <w:rPr>
+                <w:rFonts w:ascii="Times New Roman" w:cs="Times New Roman" w:eastAsia="Times New Roman" w:hAnsi="Times New Roman"/>
+                <w:sz w:val="18"/>
+                <w:szCs w:val="18"/>
+              </w:rPr>
+              <w:t xml:space="preserve">f1tenth_race_stack</w:t>
+            </w:r>
+          </w:p>
+        </w:tc>
+        <w:tc>
+          <w:tcPr>
+            <w:tcW w:type="dxa" w:w="2100"/>
+            <w:tcBorders>
+              <w:top w:val="single" w:color="999999" w:sz="2"/>
+              <w:left w:val="single" w:color="999999" w:sz="2"/>
+              <w:bottom w:val="single" w:color="999999" w:sz="2"/>
+              <w:right w:val="single" w:color="999999" w:sz="2"/>
+            </w:tcBorders>
+            <w:tcMar>
+              <w:top w:type="dxa" w:w="60"/>
+              <w:left w:type="dxa" w:w="100"/>
+              <w:bottom w:type="dxa" w:w="60"/>
+              <w:right w:type="dxa" w:w="100"/>
+            </w:tcMar>
+          </w:tcPr>
+          <w:p>
+            <w:pPr>
+              <w:jc w:val="left"/>
+            </w:pPr>
+            <w:r>
+              <w:rPr>
+                <w:rFonts w:ascii="Times New Roman" w:cs="Times New Roman" w:eastAsia="Times New Roman" w:hAnsi="Times New Roman"/>
+                <w:sz w:val="18"/>
+                <w:szCs w:val="18"/>
+              </w:rPr>
+              <w:t xml:space="preserve">Brain: Pure Pursuit, FTG, MPPI, state machine</w:t>
+            </w:r>
+          </w:p>
+        </w:tc>
+        <w:tc>
+          <w:tcPr>
+            <w:tcW w:type="dxa" w:w="1024"/>
+            <w:tcBorders>
+              <w:top w:val="single" w:color="999999" w:sz="2"/>
+              <w:left w:val="single" w:color="999999" w:sz="2"/>
+              <w:bottom w:val="single" w:color="999999" w:sz="2"/>
+              <w:right w:val="single" w:color="999999" w:sz="2"/>
+            </w:tcBorders>
+            <w:tcMar>
+              <w:top w:type="dxa" w:w="60"/>
+              <w:left w:type="dxa" w:w="100"/>
+              <w:bottom w:type="dxa" w:w="60"/>
+              <w:right w:type="dxa" w:w="100"/>
+            </w:tcMar>
+          </w:tcPr>
+          <w:p>
+            <w:pPr>
+              <w:jc w:val="left"/>
+            </w:pPr>
+            <w:r>
+              <w:rPr>
+                <w:rFonts w:ascii="Times New Roman" w:cs="Times New Roman" w:eastAsia="Times New Roman" w:hAnsi="Times New Roman"/>
+                <w:sz w:val="18"/>
+                <w:szCs w:val="18"/>
+              </w:rPr>
+              <w:t xml:space="preserve">Yes, always</w:t>
+            </w:r>
+          </w:p>
+        </w:tc>
+      </w:tr>
+    </w:tbl>
+    <w:p>
+      <w:pPr>
+        <w:spacing w:after="200" w:before="80"/>
+        <w:jc w:val="center"/>
+      </w:pPr>
+      <w:r>
+        <w:rPr>
+          <w:rFonts w:ascii="Times New Roman" w:cs="Times New Roman" w:eastAsia="Times New Roman" w:hAnsi="Times New Roman"/>
+          <w:i/>
+          <w:iCs/>
+          <w:sz w:val="18"/>
+          <w:szCs w:val="18"/>
+        </w:rPr>
+        <w:t xml:space="preserve">TABLE I-B. THE TWO ROS 2 PACKAGES IN THE WORKSPACE</w:t>
+      </w:r>
+    </w:p>
+    <w:p>
+      <w:pPr>
+        <w:spacing w:after="120" w:line="264"/>
+        <w:jc w:val="both"/>
+      </w:pPr>
+      <w:r>
+        <w:rPr>
+          <w:rFonts w:ascii="Times New Roman" w:cs="Times New Roman" w:eastAsia="Times New Roman" w:hAnsi="Times New Roman"/>
+          <w:sz w:val="20"/>
+          <w:szCs w:val="20"/>
+        </w:rPr>
+        <w:t xml:space="preserve">If a Python node inside f1tenth_race_stack is edited, the package must be rebuilt before the change takes effect:</w:t>
+      </w:r>
+    </w:p>
+    <w:p>
+      <w:pPr>
+        <w:shd w:fill="F2F2F2" w:val="clear"/>
+        <w:spacing w:after="160" w:before="80"/>
+      </w:pPr>
+      <w:r>
+        <w:rPr>
+          <w:rFonts w:ascii="Courier New" w:cs="Courier New" w:eastAsia="Courier New" w:hAnsi="Courier New"/>
+          <w:sz w:val="16"/>
+          <w:szCs w:val="16"/>
+        </w:rPr>
+        <w:t xml:space="preserve">cd ~/racer_ws</w:t>
+      </w:r>
+      <w:r>
+        <w:rPr>
+          <w:rFonts w:ascii="Courier New" w:cs="Courier New" w:eastAsia="Courier New" w:hAnsi="Courier New"/>
+          <w:sz w:val="16"/>
+          <w:szCs w:val="16"/>
+        </w:rPr>
+        <w:br/>
+        <w:t xml:space="preserve">colcon build --packages-select \</w:t>
+      </w:r>
+      <w:r>
+        <w:rPr>
+          <w:rFonts w:ascii="Courier New" w:cs="Courier New" w:eastAsia="Courier New" w:hAnsi="Courier New"/>
+          <w:sz w:val="16"/>
+          <w:szCs w:val="16"/>
+        </w:rPr>
+        <w:br/>
+        <w:t xml:space="preserve">  f1tenth_race_stack --symlink-install</w:t>
+      </w:r>
+      <w:r>
+        <w:rPr>
+          <w:rFonts w:ascii="Courier New" w:cs="Courier New" w:eastAsia="Courier New" w:hAnsi="Courier New"/>
+          <w:sz w:val="16"/>
+          <w:szCs w:val="16"/>
+        </w:rPr>
+        <w:br/>
+        <w:t xml:space="preserve">source install/setup.bash</w:t>
+      </w:r>
+    </w:p>
+    <w:p>
+      <w:pPr>
         <w:pStyle w:val="Heading1"/>
       </w:pPr>
       <w:r>
@@ -2607,6 +3012,83 @@
     </w:p>
     <w:p>
       <w:pPr>
+        <w:pStyle w:val="Heading2"/>
+      </w:pPr>
+      <w:r>
+        <w:rPr>
+          <w:rFonts w:ascii="Times New Roman" w:cs="Times New Roman" w:eastAsia="Times New Roman" w:hAnsi="Times New Roman"/>
+          <w:b/>
+          <w:bCs/>
+          <w:i/>
+          <w:iCs/>
+          <w:sz w:val="20"/>
+          <w:szCs w:val="20"/>
+        </w:rPr>
+        <w:t xml:space="preserve">C. Simulator Autonomous Mapping</w:t>
+      </w:r>
+    </w:p>
+    <w:p>
+      <w:pPr>
+        <w:spacing w:after="120" w:line="264"/>
+        <w:jc w:val="both"/>
+      </w:pPr>
+      <w:r>
+        <w:rPr>
+          <w:rFonts w:ascii="Times New Roman" w:cs="Times New Roman" w:eastAsia="Times New Roman" w:hAnsi="Times New Roman"/>
+          <w:sz w:val="20"/>
+          <w:szCs w:val="20"/>
+        </w:rPr>
+        <w:t xml:space="preserve">In addition to driving Time Trial and Head-to-Head modes in simulation, the mapping phase itself can be run entirely in simulation before any hardware is available. With the gym_bridge simulator running in one terminal, a second terminal launches the Follow-the-Gap node against the simulated LiDAR to autonomously explore and map the track:</w:t>
+      </w:r>
+    </w:p>
+    <w:p>
+      <w:pPr>
+        <w:shd w:fill="F2F2F2" w:val="clear"/>
+        <w:spacing w:after="160" w:before="80"/>
+      </w:pPr>
+      <w:r>
+        <w:rPr>
+          <w:rFonts w:ascii="Courier New" w:cs="Courier New" w:eastAsia="Courier New" w:hAnsi="Courier New"/>
+          <w:sz w:val="16"/>
+          <w:szCs w:val="16"/>
+        </w:rPr>
+        <w:t xml:space="preserve">source ~/racer_ws/install/setup.bash</w:t>
+      </w:r>
+      <w:r>
+        <w:rPr>
+          <w:rFonts w:ascii="Courier New" w:cs="Courier New" w:eastAsia="Courier New" w:hAnsi="Courier New"/>
+          <w:sz w:val="16"/>
+          <w:szCs w:val="16"/>
+        </w:rPr>
+        <w:br/>
+        <w:t xml:space="preserve">ros2 launch f1tenth_race_stack \</w:t>
+      </w:r>
+      <w:r>
+        <w:rPr>
+          <w:rFonts w:ascii="Courier New" w:cs="Courier New" w:eastAsia="Courier New" w:hAnsi="Courier New"/>
+          <w:sz w:val="16"/>
+          <w:szCs w:val="16"/>
+        </w:rPr>
+        <w:br/>
+        <w:t xml:space="preserve">  sim_mapping.launch.py</w:t>
+      </w:r>
+    </w:p>
+    <w:p>
+      <w:pPr>
+        <w:spacing w:after="120" w:line="264"/>
+        <w:jc w:val="both"/>
+      </w:pPr>
+      <w:r>
+        <w:rPr>
+          <w:rFonts w:ascii="Times New Roman" w:cs="Times New Roman" w:eastAsia="Times New Roman" w:hAnsi="Times New Roman"/>
+          <w:sz w:val="20"/>
+          <w:szCs w:val="20"/>
+        </w:rPr>
+        <w:t xml:space="preserve">The vehicle drives itself in RViz while slam_toolbox builds the occupancy grid; the map is saved with map_saver_cli exactly as in the hardware workflow (Section IV-A), giving a complete unmapped-track-to-racing-line pipeline that requires no physical car.</w:t>
+      </w:r>
+    </w:p>
+    <w:p>
+      <w:pPr>
         <w:pStyle w:val="Heading1"/>
       </w:pPr>
       <w:r>
@@ -2642,7 +3124,7 @@
       <w:r>
         <w:drawing>
           <wp:inline distT="0" distB="0" distL="0" distR="0">
-            <wp:extent cx="3048000" cy="2105025"/>
+            <wp:extent cx="2743200" cy="1963882"/>
             <wp:effectExtent t="0" r="0" b="0" l="0"/>
             <wp:docPr id="1" name="Node architecture and data-flow diagram" descr="Node architecture and data-flow diagram" title="Node architecture and data-flow diagram"/>
             <wp:cNvGraphicFramePr>
@@ -2667,7 +3149,7 @@
                   <pic:spPr bwMode="auto">
                     <a:xfrm>
                       <a:off x="0" y="0"/>
-                      <a:ext cx="3048000" cy="2105025"/>
+                      <a:ext cx="2743200" cy="1963882"/>
                     </a:xfrm>
                     <a:prstGeom prst="rect">
                       <a:avLst/>
@@ -2739,7 +3221,7 @@
       <w:r>
         <w:drawing>
           <wp:inline distT="0" distB="0" distL="0" distR="0">
-            <wp:extent cx="3048000" cy="2171700"/>
+            <wp:extent cx="2743200" cy="1963882"/>
             <wp:effectExtent t="0" r="0" b="0" l="0"/>
             <wp:docPr id="1" name="MPPI rollout sampling around an opponent" descr="MPPI rollout sampling around an opponent" title="MPPI rollout sampling around an opponent"/>
             <wp:cNvGraphicFramePr>
@@ -2764,7 +3246,7 @@
                   <pic:spPr bwMode="auto">
                     <a:xfrm>
                       <a:off x="0" y="0"/>
-                      <a:ext cx="3048000" cy="2171700"/>
+                      <a:ext cx="2743200" cy="1963882"/>
                     </a:xfrm>
                     <a:prstGeom prst="rect">
                       <a:avLst/>
@@ -2795,6 +3277,68 @@
     </w:p>
     <w:p>
       <w:pPr>
+        <w:spacing w:after="40" w:before="160"/>
+        <w:jc w:val="center"/>
+      </w:pPr>
+      <w:r>
+        <w:drawing>
+          <wp:inline distT="0" distB="0" distL="0" distR="0">
+            <wp:extent cx="2743200" cy="1959429"/>
+            <wp:effectExtent t="0" r="0" b="0" l="0"/>
+            <wp:docPr id="1" name="MPPI rollout count vs compute time" descr="MPPI rollout count vs compute time" title="MPPI rollout count vs compute time"/>
+            <wp:cNvGraphicFramePr>
+              <a:graphicFrameLocks xmlns:a="http://schemas.openxmlformats.org/drawingml/2006/main" noChangeAspect="1"/>
+            </wp:cNvGraphicFramePr>
+            <a:graphic xmlns:a="http://schemas.openxmlformats.org/drawingml/2006/main">
+              <a:graphicData uri="http://schemas.openxmlformats.org/drawingml/2006/picture">
+                <pic:pic xmlns:pic="http://schemas.openxmlformats.org/drawingml/2006/picture">
+                  <pic:nvPicPr>
+                    <pic:cNvPr id="0" name="" descr=""/>
+                    <pic:cNvPicPr>
+                      <a:picLocks noChangeAspect="1" noChangeArrowheads="1"/>
+                    </pic:cNvPicPr>
+                  </pic:nvPicPr>
+                  <pic:blipFill>
+                    <a:blip r:embed="rId16" cstate="none"/>
+                    <a:srcRect/>
+                    <a:stretch>
+                      <a:fillRect/>
+                    </a:stretch>
+                  </pic:blipFill>
+                  <pic:spPr bwMode="auto">
+                    <a:xfrm>
+                      <a:off x="0" y="0"/>
+                      <a:ext cx="2743200" cy="1959429"/>
+                    </a:xfrm>
+                    <a:prstGeom prst="rect">
+                      <a:avLst/>
+                    </a:prstGeom>
+                  </pic:spPr>
+                </pic:pic>
+              </a:graphicData>
+            </a:graphic>
+          </wp:inline>
+        </w:drawing>
+      </w:r>
+    </w:p>
+    <w:p>
+      <w:pPr>
+        <w:spacing w:after="200" w:before="80"/>
+        <w:jc w:val="center"/>
+      </w:pPr>
+      <w:r>
+        <w:rPr>
+          <w:rFonts w:ascii="Times New Roman" w:cs="Times New Roman" w:eastAsia="Times New Roman" w:hAnsi="Times New Roman"/>
+          <w:i/>
+          <w:iCs/>
+          <w:sz w:val="18"/>
+          <w:szCs w:val="18"/>
+        </w:rPr>
+        <w:t xml:space="preserve">Fig. 3. Per-iteration compute time of the vectorized NumPy MPPI implementation scales near-linearly with rollout count K, remaining inside the 25 ms budget of a 40 Hz control loop for K up to roughly 1500 on the Intel NUC 12 Pro, whereas a naive per-rollout Python loop does not.</w:t>
+      </w:r>
+    </w:p>
+    <w:p>
+      <w:pPr>
         <w:pStyle w:val="ListParagraph"/>
         <w:numPr>
           <w:ilvl w:val="0"/>
@@ -2819,7 +3363,7 @@
       <w:r>
         <w:drawing>
           <wp:inline distT="0" distB="0" distL="0" distR="0">
-            <wp:extent cx="3048000" cy="1743075"/>
+            <wp:extent cx="2743200" cy="1963882"/>
             <wp:effectExtent t="0" r="0" b="0" l="0"/>
             <wp:docPr id="1" name="Pure Pursuit lookahead geometry" descr="Pure Pursuit lookahead geometry" title="Pure Pursuit lookahead geometry"/>
             <wp:cNvGraphicFramePr>
@@ -2844,7 +3388,7 @@
                   <pic:spPr bwMode="auto">
                     <a:xfrm>
                       <a:off x="0" y="0"/>
-                      <a:ext cx="3048000" cy="1743075"/>
+                      <a:ext cx="2743200" cy="1963882"/>
                     </a:xfrm>
                     <a:prstGeom prst="rect">
                       <a:avLst/>
@@ -2870,7 +3414,69 @@
           <w:sz w:val="18"/>
           <w:szCs w:val="18"/>
         </w:rPr>
-        <w:t xml:space="preserve">Fig. 3. Pure Pursuit geometry: a lookahead point is selected on the racing line and a constant-curvature steering arc of radius R is computed to reach it.</w:t>
+        <w:t xml:space="preserve">Fig. 4. Pure Pursuit geometry: a lookahead point is selected on the racing line and a constant-curvature steering arc of radius R is computed to reach it.</w:t>
+      </w:r>
+    </w:p>
+    <w:p>
+      <w:pPr>
+        <w:spacing w:after="40" w:before="160"/>
+        <w:jc w:val="center"/>
+      </w:pPr>
+      <w:r>
+        <w:drawing>
+          <wp:inline distT="0" distB="0" distL="0" distR="0">
+            <wp:extent cx="2743200" cy="1959429"/>
+            <wp:effectExtent t="0" r="0" b="0" l="0"/>
+            <wp:docPr id="1" name="Pure Pursuit adaptive lookahead vs speed" descr="Pure Pursuit adaptive lookahead vs speed" title="Pure Pursuit adaptive lookahead vs speed"/>
+            <wp:cNvGraphicFramePr>
+              <a:graphicFrameLocks xmlns:a="http://schemas.openxmlformats.org/drawingml/2006/main" noChangeAspect="1"/>
+            </wp:cNvGraphicFramePr>
+            <a:graphic xmlns:a="http://schemas.openxmlformats.org/drawingml/2006/main">
+              <a:graphicData uri="http://schemas.openxmlformats.org/drawingml/2006/picture">
+                <pic:pic xmlns:pic="http://schemas.openxmlformats.org/drawingml/2006/picture">
+                  <pic:nvPicPr>
+                    <pic:cNvPr id="0" name="" descr=""/>
+                    <pic:cNvPicPr>
+                      <a:picLocks noChangeAspect="1" noChangeArrowheads="1"/>
+                    </pic:cNvPicPr>
+                  </pic:nvPicPr>
+                  <pic:blipFill>
+                    <a:blip r:embed="rId17" cstate="none"/>
+                    <a:srcRect/>
+                    <a:stretch>
+                      <a:fillRect/>
+                    </a:stretch>
+                  </pic:blipFill>
+                  <pic:spPr bwMode="auto">
+                    <a:xfrm>
+                      <a:off x="0" y="0"/>
+                      <a:ext cx="2743200" cy="1959429"/>
+                    </a:xfrm>
+                    <a:prstGeom prst="rect">
+                      <a:avLst/>
+                    </a:prstGeom>
+                  </pic:spPr>
+                </pic:pic>
+              </a:graphicData>
+            </a:graphic>
+          </wp:inline>
+        </w:drawing>
+      </w:r>
+    </w:p>
+    <w:p>
+      <w:pPr>
+        <w:spacing w:after="200" w:before="80"/>
+        <w:jc w:val="center"/>
+      </w:pPr>
+      <w:r>
+        <w:rPr>
+          <w:rFonts w:ascii="Times New Roman" w:cs="Times New Roman" w:eastAsia="Times New Roman" w:hAnsi="Times New Roman"/>
+          <w:i/>
+          <w:iCs/>
+          <w:sz w:val="18"/>
+          <w:szCs w:val="18"/>
+        </w:rPr>
+        <w:t xml:space="preserve">Fig. 5. Effect of lookahead_gain on the adaptive lookahead distance: at lookahead_gain = 0 the lookahead is constant, while higher gains stretch the lookahead point further ahead as speed increases, smoothing steering commands on fast straights.</w:t>
       </w:r>
     </w:p>
     <w:p>
@@ -2916,7 +3522,7 @@
       <w:r>
         <w:drawing>
           <wp:inline distT="0" distB="0" distL="0" distR="0">
-            <wp:extent cx="2857500" cy="1714500"/>
+            <wp:extent cx="2743200" cy="1963882"/>
             <wp:effectExtent t="0" r="0" b="0" l="0"/>
             <wp:docPr id="1" name="Follow-the-Gap reactive navigation concept" descr="Follow-the-Gap reactive navigation concept" title="Follow-the-Gap reactive navigation concept"/>
             <wp:cNvGraphicFramePr>
@@ -2941,7 +3547,7 @@
                   <pic:spPr bwMode="auto">
                     <a:xfrm>
                       <a:off x="0" y="0"/>
-                      <a:ext cx="2857500" cy="1714500"/>
+                      <a:ext cx="2743200" cy="1963882"/>
                     </a:xfrm>
                     <a:prstGeom prst="rect">
                       <a:avLst/>
@@ -2967,7 +3573,7 @@
           <w:sz w:val="18"/>
           <w:szCs w:val="18"/>
         </w:rPr>
-        <w:t xml:space="preserve">Fig. 4. Follow-the-Gap: safety bubbles are inflated around nearby LiDAR returns, the largest free-space gap is identified, and the vehicle steers toward its furthest point.</w:t>
+        <w:t xml:space="preserve">Fig. 6. Follow-the-Gap: safety bubbles are inflated around nearby LiDAR returns, the largest free-space gap is identified, and the vehicle steers toward its furthest point.</w:t>
       </w:r>
     </w:p>
     <w:p>
@@ -2996,7 +3602,7 @@
       <w:r>
         <w:drawing>
           <wp:inline distT="0" distB="0" distL="0" distR="0">
-            <wp:extent cx="2857500" cy="1752600"/>
+            <wp:extent cx="2743200" cy="1550583"/>
             <wp:effectExtent t="0" r="0" b="0" l="0"/>
             <wp:docPr id="1" name="Curvature-aware speed profile along the track" descr="Curvature-aware speed profile along the track" title="Curvature-aware speed profile along the track"/>
             <wp:cNvGraphicFramePr>
@@ -3021,7 +3627,7 @@
                   <pic:spPr bwMode="auto">
                     <a:xfrm>
                       <a:off x="0" y="0"/>
-                      <a:ext cx="2857500" cy="1752600"/>
+                      <a:ext cx="2743200" cy="1550583"/>
                     </a:xfrm>
                     <a:prstGeom prst="rect">
                       <a:avLst/>
@@ -3047,7 +3653,69 @@
           <w:sz w:val="18"/>
           <w:szCs w:val="18"/>
         </w:rPr>
-        <w:t xml:space="preserve">Fig. 6. Curvature-aware speed profiling: as track curvature κ(s) rises through a corner, the target speed v(s) automatically ramps down, then back up on the following straight, with no manual sector definitions.</w:t>
+        <w:t xml:space="preserve">Fig. 7. Curvature-aware speed profiling: as track curvature κ(s) rises through a corner, the target speed v(s) automatically ramps down, then back up on the following straight, with no manual sector definitions.</w:t>
+      </w:r>
+    </w:p>
+    <w:p>
+      <w:pPr>
+        <w:spacing w:after="40" w:before="160"/>
+        <w:jc w:val="center"/>
+      </w:pPr>
+      <w:r>
+        <w:drawing>
+          <wp:inline distT="0" distB="0" distL="0" distR="0">
+            <wp:extent cx="2743200" cy="2041451"/>
+            <wp:effectExtent t="0" r="0" b="0" l="0"/>
+            <wp:docPr id="1" name="Curvature-optimal racing line speed heatmap" descr="Curvature-optimal racing line speed heatmap" title="Curvature-optimal racing line speed heatmap"/>
+            <wp:cNvGraphicFramePr>
+              <a:graphicFrameLocks xmlns:a="http://schemas.openxmlformats.org/drawingml/2006/main" noChangeAspect="1"/>
+            </wp:cNvGraphicFramePr>
+            <a:graphic xmlns:a="http://schemas.openxmlformats.org/drawingml/2006/main">
+              <a:graphicData uri="http://schemas.openxmlformats.org/drawingml/2006/picture">
+                <pic:pic xmlns:pic="http://schemas.openxmlformats.org/drawingml/2006/picture">
+                  <pic:nvPicPr>
+                    <pic:cNvPr id="0" name="" descr=""/>
+                    <pic:cNvPicPr>
+                      <a:picLocks noChangeAspect="1" noChangeArrowheads="1"/>
+                    </pic:cNvPicPr>
+                  </pic:nvPicPr>
+                  <pic:blipFill>
+                    <a:blip r:embed="rId18" cstate="none"/>
+                    <a:srcRect/>
+                    <a:stretch>
+                      <a:fillRect/>
+                    </a:stretch>
+                  </pic:blipFill>
+                  <pic:spPr bwMode="auto">
+                    <a:xfrm>
+                      <a:off x="0" y="0"/>
+                      <a:ext cx="2743200" cy="2041451"/>
+                    </a:xfrm>
+                    <a:prstGeom prst="rect">
+                      <a:avLst/>
+                    </a:prstGeom>
+                  </pic:spPr>
+                </pic:pic>
+              </a:graphicData>
+            </a:graphic>
+          </wp:inline>
+        </w:drawing>
+      </w:r>
+    </w:p>
+    <w:p>
+      <w:pPr>
+        <w:spacing w:after="200" w:before="80"/>
+        <w:jc w:val="center"/>
+      </w:pPr>
+      <w:r>
+        <w:rPr>
+          <w:rFonts w:ascii="Times New Roman" w:cs="Times New Roman" w:eastAsia="Times New Roman" w:hAnsi="Times New Roman"/>
+          <w:i/>
+          <w:iCs/>
+          <w:sz w:val="18"/>
+          <w:szCs w:val="18"/>
+        </w:rPr>
+        <w:t xml:space="preserve">Fig. 8. Example output of racing_line_generator.py: the extracted centerline is colored by its computed target speed v(s), showing automatic braking (red/orange) through corners and full-speed acceleration (green) on straights, with no manually defined sectors.</w:t>
       </w:r>
     </w:p>
     <w:p>
@@ -3093,7 +3761,7 @@
       <w:r>
         <w:drawing>
           <wp:inline distT="0" distB="0" distL="0" distR="0">
-            <wp:extent cx="2857500" cy="1838325"/>
+            <wp:extent cx="2743200" cy="1963882"/>
             <wp:effectExtent t="0" r="0" b="0" l="0"/>
             <wp:docPr id="1" name="Deadman switch decision logic" descr="Deadman switch decision logic" title="Deadman switch decision logic"/>
             <wp:cNvGraphicFramePr>
@@ -3118,7 +3786,7 @@
                   <pic:spPr bwMode="auto">
                     <a:xfrm>
                       <a:off x="0" y="0"/>
-                      <a:ext cx="2857500" cy="1838325"/>
+                      <a:ext cx="2743200" cy="1963882"/>
                     </a:xfrm>
                     <a:prstGeom prst="rect">
                       <a:avLst/>
@@ -3144,7 +3812,7 @@
           <w:sz w:val="18"/>
           <w:szCs w:val="18"/>
         </w:rPr>
-        <w:t xml:space="preserve">Fig. 5. Decision logic of the deadman switch: planner commands reach the wheels only while Button 5 is held; otherwise zero-velocity commands are published at 50 Hz.</w:t>
+        <w:t xml:space="preserve">Fig. 9. Decision logic of the deadman switch: planner commands reach the wheels only while Button 5 is held; otherwise zero-velocity commands are published at 50 Hz.</w:t>
       </w:r>
     </w:p>
     <w:p>
@@ -3273,7 +3941,7 @@
       <w:r>
         <w:drawing>
           <wp:inline distT="0" distB="0" distL="0" distR="0">
-            <wp:extent cx="2857500" cy="942975"/>
+            <wp:extent cx="2743200" cy="1963882"/>
             <wp:effectExtent t="0" r="0" b="0" l="0"/>
             <wp:docPr id="1" name="Five-phase deployment workflow" descr="Five-phase deployment workflow" title="Five-phase deployment workflow"/>
             <wp:cNvGraphicFramePr>
@@ -3298,7 +3966,7 @@
                   <pic:spPr bwMode="auto">
                     <a:xfrm>
                       <a:off x="0" y="0"/>
-                      <a:ext cx="2857500" cy="942975"/>
+                      <a:ext cx="2743200" cy="1963882"/>
                     </a:xfrm>
                     <a:prstGeom prst="rect">
                       <a:avLst/>
@@ -3324,7 +3992,7 @@
           <w:sz w:val="18"/>
           <w:szCs w:val="18"/>
         </w:rPr>
-        <w:t xml:space="preserve">Fig. 7. The five-phase deployment workflow, executed in sequence for every new track.</w:t>
+        <w:t xml:space="preserve">Fig. 10. The five-phase deployment workflow, executed in sequence for every new track.</w:t>
       </w:r>
     </w:p>
     <w:p>
@@ -3393,6 +4061,68 @@
           <w:szCs w:val="20"/>
         </w:rPr>
         <w:t xml:space="preserve">Look at the terminal output to find the ERPM for a given speed (e.g., 2.0 m/s), and update erpm_gain in config/vesc_bridge_params.yaml.</w:t>
+      </w:r>
+    </w:p>
+    <w:p>
+      <w:pPr>
+        <w:spacing w:after="40" w:before="160"/>
+        <w:jc w:val="center"/>
+      </w:pPr>
+      <w:r>
+        <w:drawing>
+          <wp:inline distT="0" distB="0" distL="0" distR="0">
+            <wp:extent cx="2743200" cy="1959429"/>
+            <wp:effectExtent t="0" r="0" b="0" l="0"/>
+            <wp:docPr id="1" name="ERPM to speed calibration" descr="ERPM to speed calibration" title="ERPM to speed calibration"/>
+            <wp:cNvGraphicFramePr>
+              <a:graphicFrameLocks xmlns:a="http://schemas.openxmlformats.org/drawingml/2006/main" noChangeAspect="1"/>
+            </wp:cNvGraphicFramePr>
+            <a:graphic xmlns:a="http://schemas.openxmlformats.org/drawingml/2006/main">
+              <a:graphicData uri="http://schemas.openxmlformats.org/drawingml/2006/picture">
+                <pic:pic xmlns:pic="http://schemas.openxmlformats.org/drawingml/2006/picture">
+                  <pic:nvPicPr>
+                    <pic:cNvPr id="0" name="" descr=""/>
+                    <pic:cNvPicPr>
+                      <a:picLocks noChangeAspect="1" noChangeArrowheads="1"/>
+                    </pic:cNvPicPr>
+                  </pic:nvPicPr>
+                  <pic:blipFill>
+                    <a:blip r:embed="rId19" cstate="none"/>
+                    <a:srcRect/>
+                    <a:stretch>
+                      <a:fillRect/>
+                    </a:stretch>
+                  </pic:blipFill>
+                  <pic:spPr bwMode="auto">
+                    <a:xfrm>
+                      <a:off x="0" y="0"/>
+                      <a:ext cx="2743200" cy="1959429"/>
+                    </a:xfrm>
+                    <a:prstGeom prst="rect">
+                      <a:avLst/>
+                    </a:prstGeom>
+                  </pic:spPr>
+                </pic:pic>
+              </a:graphicData>
+            </a:graphic>
+          </wp:inline>
+        </w:drawing>
+      </w:r>
+    </w:p>
+    <w:p>
+      <w:pPr>
+        <w:spacing w:after="200" w:before="80"/>
+        <w:jc w:val="center"/>
+      </w:pPr>
+      <w:r>
+        <w:rPr>
+          <w:rFonts w:ascii="Times New Roman" w:cs="Times New Roman" w:eastAsia="Times New Roman" w:hAnsi="Times New Roman"/>
+          <w:i/>
+          <w:iCs/>
+          <w:sz w:val="18"/>
+          <w:szCs w:val="18"/>
+        </w:rPr>
+        <w:t xml:space="preserve">Fig. 11. Representative system-identification calibration run: commanded ERPM plotted against ground-truth measured speed over a 10 m straight. A linear fit through the samples yields the erpm_gain constant used by vesc_bridge.py to convert Ackermann speed commands into VESC ERPM.</w:t>
       </w:r>
     </w:p>
     <w:p>
@@ -4382,6 +5112,616 @@
         </w:rPr>
         <w:br/>
         <w:t xml:space="preserve">ros2 param set /mppi_controller mppi.K 1500</w:t>
+      </w:r>
+    </w:p>
+    <w:p>
+      <w:pPr>
+        <w:pStyle w:val="Heading2"/>
+      </w:pPr>
+      <w:r>
+        <w:rPr>
+          <w:rFonts w:ascii="Times New Roman" w:cs="Times New Roman" w:eastAsia="Times New Roman" w:hAnsi="Times New Roman"/>
+          <w:b/>
+          <w:bCs/>
+          <w:i/>
+          <w:iCs/>
+          <w:sz w:val="20"/>
+          <w:szCs w:val="20"/>
+        </w:rPr>
+        <w:t xml:space="preserve">D. Speed Scale Reference and Live-Tuning Safety</w:t>
+      </w:r>
+    </w:p>
+    <w:p>
+      <w:pPr>
+        <w:spacing w:after="120" w:line="264"/>
+        <w:jc w:val="both"/>
+      </w:pPr>
+      <w:r>
+        <w:rPr>
+          <w:rFonts w:ascii="Times New Roman" w:cs="Times New Roman" w:eastAsia="Times New Roman" w:hAnsi="Times New Roman"/>
+          <w:sz w:val="20"/>
+          <w:szCs w:val="20"/>
+        </w:rPr>
+        <w:t xml:space="preserve">Table III converts the pure_pursuit.speed_scale multiplier into the resulting straight-line speed for the default racing line, giving operators a concrete sense of how aggressive a given scale value is before committing to it on hardware.</w:t>
+      </w:r>
+    </w:p>
+    <w:tbl>
+      <w:tblPr>
+        <w:tblW w:type="dxa" w:w="4824"/>
+        <w:tblBorders>
+          <w:top w:val="single" w:color="auto" w:sz="4"/>
+          <w:left w:val="single" w:color="auto" w:sz="4"/>
+          <w:bottom w:val="single" w:color="auto" w:sz="4"/>
+          <w:right w:val="single" w:color="auto" w:sz="4"/>
+          <w:insideH w:val="single" w:color="auto" w:sz="4"/>
+          <w:insideV w:val="single" w:color="auto" w:sz="4"/>
+        </w:tblBorders>
+      </w:tblPr>
+      <w:tblGrid>
+        <w:gridCol w:w="1200"/>
+        <w:gridCol w:w="1900"/>
+        <w:gridCol w:w="1724"/>
+      </w:tblGrid>
+      <w:tr>
+        <w:tc>
+          <w:tcPr>
+            <w:tcW w:type="dxa" w:w="1200"/>
+            <w:tcBorders>
+              <w:top w:val="single" w:color="999999" w:sz="2"/>
+              <w:left w:val="single" w:color="999999" w:sz="2"/>
+              <w:bottom w:val="single" w:color="999999" w:sz="2"/>
+              <w:right w:val="single" w:color="999999" w:sz="2"/>
+            </w:tcBorders>
+            <w:shd w:fill="D9D9D9" w:val="clear"/>
+            <w:tcMar>
+              <w:top w:type="dxa" w:w="60"/>
+              <w:left w:type="dxa" w:w="100"/>
+              <w:bottom w:type="dxa" w:w="60"/>
+              <w:right w:type="dxa" w:w="100"/>
+            </w:tcMar>
+          </w:tcPr>
+          <w:p>
+            <w:pPr>
+              <w:jc w:val="left"/>
+            </w:pPr>
+            <w:r>
+              <w:rPr>
+                <w:rFonts w:ascii="Times New Roman" w:cs="Times New Roman" w:eastAsia="Times New Roman" w:hAnsi="Times New Roman"/>
+                <w:b/>
+                <w:bCs/>
+                <w:sz w:val="18"/>
+                <w:szCs w:val="18"/>
+              </w:rPr>
+              <w:t xml:space="preserve">speed_scale</w:t>
+            </w:r>
+          </w:p>
+        </w:tc>
+        <w:tc>
+          <w:tcPr>
+            <w:tcW w:type="dxa" w:w="1900"/>
+            <w:tcBorders>
+              <w:top w:val="single" w:color="999999" w:sz="2"/>
+              <w:left w:val="single" w:color="999999" w:sz="2"/>
+              <w:bottom w:val="single" w:color="999999" w:sz="2"/>
+              <w:right w:val="single" w:color="999999" w:sz="2"/>
+            </w:tcBorders>
+            <w:shd w:fill="D9D9D9" w:val="clear"/>
+            <w:tcMar>
+              <w:top w:type="dxa" w:w="60"/>
+              <w:left w:type="dxa" w:w="100"/>
+              <w:bottom w:type="dxa" w:w="60"/>
+              <w:right w:type="dxa" w:w="100"/>
+            </w:tcMar>
+          </w:tcPr>
+          <w:p>
+            <w:pPr>
+              <w:jc w:val="left"/>
+            </w:pPr>
+            <w:r>
+              <w:rPr>
+                <w:rFonts w:ascii="Times New Roman" w:cs="Times New Roman" w:eastAsia="Times New Roman" w:hAnsi="Times New Roman"/>
+                <w:b/>
+                <w:bCs/>
+                <w:sz w:val="18"/>
+                <w:szCs w:val="18"/>
+              </w:rPr>
+              <w:t xml:space="preserve">Straight speed</w:t>
+            </w:r>
+          </w:p>
+        </w:tc>
+        <w:tc>
+          <w:tcPr>
+            <w:tcW w:type="dxa" w:w="1724"/>
+            <w:tcBorders>
+              <w:top w:val="single" w:color="999999" w:sz="2"/>
+              <w:left w:val="single" w:color="999999" w:sz="2"/>
+              <w:bottom w:val="single" w:color="999999" w:sz="2"/>
+              <w:right w:val="single" w:color="999999" w:sz="2"/>
+            </w:tcBorders>
+            <w:shd w:fill="D9D9D9" w:val="clear"/>
+            <w:tcMar>
+              <w:top w:type="dxa" w:w="60"/>
+              <w:left w:type="dxa" w:w="100"/>
+              <w:bottom w:type="dxa" w:w="60"/>
+              <w:right w:type="dxa" w:w="100"/>
+            </w:tcMar>
+          </w:tcPr>
+          <w:p>
+            <w:pPr>
+              <w:jc w:val="left"/>
+            </w:pPr>
+            <w:r>
+              <w:rPr>
+                <w:rFonts w:ascii="Times New Roman" w:cs="Times New Roman" w:eastAsia="Times New Roman" w:hAnsi="Times New Roman"/>
+                <w:b/>
+                <w:bCs/>
+                <w:sz w:val="18"/>
+                <w:szCs w:val="18"/>
+              </w:rPr>
+              <w:t xml:space="preserve">Recommended use</w:t>
+            </w:r>
+          </w:p>
+        </w:tc>
+      </w:tr>
+      <w:tr>
+        <w:tc>
+          <w:tcPr>
+            <w:tcW w:type="dxa" w:w="1200"/>
+            <w:tcBorders>
+              <w:top w:val="single" w:color="999999" w:sz="2"/>
+              <w:left w:val="single" w:color="999999" w:sz="2"/>
+              <w:bottom w:val="single" w:color="999999" w:sz="2"/>
+              <w:right w:val="single" w:color="999999" w:sz="2"/>
+            </w:tcBorders>
+            <w:tcMar>
+              <w:top w:type="dxa" w:w="60"/>
+              <w:left w:type="dxa" w:w="100"/>
+              <w:bottom w:type="dxa" w:w="60"/>
+              <w:right w:type="dxa" w:w="100"/>
+            </w:tcMar>
+          </w:tcPr>
+          <w:p>
+            <w:pPr>
+              <w:jc w:val="left"/>
+            </w:pPr>
+            <w:r>
+              <w:rPr>
+                <w:rFonts w:ascii="Times New Roman" w:cs="Times New Roman" w:eastAsia="Times New Roman" w:hAnsi="Times New Roman"/>
+                <w:sz w:val="18"/>
+                <w:szCs w:val="18"/>
+              </w:rPr>
+              <w:t xml:space="preserve">0.5</w:t>
+            </w:r>
+          </w:p>
+        </w:tc>
+        <w:tc>
+          <w:tcPr>
+            <w:tcW w:type="dxa" w:w="1900"/>
+            <w:tcBorders>
+              <w:top w:val="single" w:color="999999" w:sz="2"/>
+              <w:left w:val="single" w:color="999999" w:sz="2"/>
+              <w:bottom w:val="single" w:color="999999" w:sz="2"/>
+              <w:right w:val="single" w:color="999999" w:sz="2"/>
+            </w:tcBorders>
+            <w:tcMar>
+              <w:top w:type="dxa" w:w="60"/>
+              <w:left w:type="dxa" w:w="100"/>
+              <w:bottom w:type="dxa" w:w="60"/>
+              <w:right w:type="dxa" w:w="100"/>
+            </w:tcMar>
+          </w:tcPr>
+          <w:p>
+            <w:pPr>
+              <w:jc w:val="left"/>
+            </w:pPr>
+            <w:r>
+              <w:rPr>
+                <w:rFonts w:ascii="Times New Roman" w:cs="Times New Roman" w:eastAsia="Times New Roman" w:hAnsi="Times New Roman"/>
+                <w:sz w:val="18"/>
+                <w:szCs w:val="18"/>
+              </w:rPr>
+              <w:t xml:space="preserve">1.5 m/s (5.4 km/h)</w:t>
+            </w:r>
+          </w:p>
+        </w:tc>
+        <w:tc>
+          <w:tcPr>
+            <w:tcW w:type="dxa" w:w="1724"/>
+            <w:tcBorders>
+              <w:top w:val="single" w:color="999999" w:sz="2"/>
+              <w:left w:val="single" w:color="999999" w:sz="2"/>
+              <w:bottom w:val="single" w:color="999999" w:sz="2"/>
+              <w:right w:val="single" w:color="999999" w:sz="2"/>
+            </w:tcBorders>
+            <w:tcMar>
+              <w:top w:type="dxa" w:w="60"/>
+              <w:left w:type="dxa" w:w="100"/>
+              <w:bottom w:type="dxa" w:w="60"/>
+              <w:right w:type="dxa" w:w="100"/>
+            </w:tcMar>
+          </w:tcPr>
+          <w:p>
+            <w:pPr>
+              <w:jc w:val="left"/>
+            </w:pPr>
+            <w:r>
+              <w:rPr>
+                <w:rFonts w:ascii="Times New Roman" w:cs="Times New Roman" w:eastAsia="Times New Roman" w:hAnsi="Times New Roman"/>
+                <w:sz w:val="18"/>
+                <w:szCs w:val="18"/>
+              </w:rPr>
+              <w:t xml:space="preserve">Learning / first laps</w:t>
+            </w:r>
+          </w:p>
+        </w:tc>
+      </w:tr>
+      <w:tr>
+        <w:tc>
+          <w:tcPr>
+            <w:tcW w:type="dxa" w:w="1200"/>
+            <w:tcBorders>
+              <w:top w:val="single" w:color="999999" w:sz="2"/>
+              <w:left w:val="single" w:color="999999" w:sz="2"/>
+              <w:bottom w:val="single" w:color="999999" w:sz="2"/>
+              <w:right w:val="single" w:color="999999" w:sz="2"/>
+            </w:tcBorders>
+            <w:tcMar>
+              <w:top w:type="dxa" w:w="60"/>
+              <w:left w:type="dxa" w:w="100"/>
+              <w:bottom w:type="dxa" w:w="60"/>
+              <w:right w:type="dxa" w:w="100"/>
+            </w:tcMar>
+          </w:tcPr>
+          <w:p>
+            <w:pPr>
+              <w:jc w:val="left"/>
+            </w:pPr>
+            <w:r>
+              <w:rPr>
+                <w:rFonts w:ascii="Times New Roman" w:cs="Times New Roman" w:eastAsia="Times New Roman" w:hAnsi="Times New Roman"/>
+                <w:sz w:val="18"/>
+                <w:szCs w:val="18"/>
+              </w:rPr>
+              <w:t xml:space="preserve">0.8</w:t>
+            </w:r>
+          </w:p>
+        </w:tc>
+        <w:tc>
+          <w:tcPr>
+            <w:tcW w:type="dxa" w:w="1900"/>
+            <w:tcBorders>
+              <w:top w:val="single" w:color="999999" w:sz="2"/>
+              <w:left w:val="single" w:color="999999" w:sz="2"/>
+              <w:bottom w:val="single" w:color="999999" w:sz="2"/>
+              <w:right w:val="single" w:color="999999" w:sz="2"/>
+            </w:tcBorders>
+            <w:tcMar>
+              <w:top w:type="dxa" w:w="60"/>
+              <w:left w:type="dxa" w:w="100"/>
+              <w:bottom w:type="dxa" w:w="60"/>
+              <w:right w:type="dxa" w:w="100"/>
+            </w:tcMar>
+          </w:tcPr>
+          <w:p>
+            <w:pPr>
+              <w:jc w:val="left"/>
+            </w:pPr>
+            <w:r>
+              <w:rPr>
+                <w:rFonts w:ascii="Times New Roman" w:cs="Times New Roman" w:eastAsia="Times New Roman" w:hAnsi="Times New Roman"/>
+                <w:sz w:val="18"/>
+                <w:szCs w:val="18"/>
+              </w:rPr>
+              <w:t xml:space="preserve">2.4 m/s (8.6 km/h)</w:t>
+            </w:r>
+          </w:p>
+        </w:tc>
+        <w:tc>
+          <w:tcPr>
+            <w:tcW w:type="dxa" w:w="1724"/>
+            <w:tcBorders>
+              <w:top w:val="single" w:color="999999" w:sz="2"/>
+              <w:left w:val="single" w:color="999999" w:sz="2"/>
+              <w:bottom w:val="single" w:color="999999" w:sz="2"/>
+              <w:right w:val="single" w:color="999999" w:sz="2"/>
+            </w:tcBorders>
+            <w:tcMar>
+              <w:top w:type="dxa" w:w="60"/>
+              <w:left w:type="dxa" w:w="100"/>
+              <w:bottom w:type="dxa" w:w="60"/>
+              <w:right w:type="dxa" w:w="100"/>
+            </w:tcMar>
+          </w:tcPr>
+          <w:p>
+            <w:pPr>
+              <w:jc w:val="left"/>
+            </w:pPr>
+            <w:r>
+              <w:rPr>
+                <w:rFonts w:ascii="Times New Roman" w:cs="Times New Roman" w:eastAsia="Times New Roman" w:hAnsi="Times New Roman"/>
+                <w:sz w:val="18"/>
+                <w:szCs w:val="18"/>
+              </w:rPr>
+              <w:t xml:space="preserve">Confident tuning</w:t>
+            </w:r>
+          </w:p>
+        </w:tc>
+      </w:tr>
+      <w:tr>
+        <w:tc>
+          <w:tcPr>
+            <w:tcW w:type="dxa" w:w="1200"/>
+            <w:tcBorders>
+              <w:top w:val="single" w:color="999999" w:sz="2"/>
+              <w:left w:val="single" w:color="999999" w:sz="2"/>
+              <w:bottom w:val="single" w:color="999999" w:sz="2"/>
+              <w:right w:val="single" w:color="999999" w:sz="2"/>
+            </w:tcBorders>
+            <w:tcMar>
+              <w:top w:type="dxa" w:w="60"/>
+              <w:left w:type="dxa" w:w="100"/>
+              <w:bottom w:type="dxa" w:w="60"/>
+              <w:right w:type="dxa" w:w="100"/>
+            </w:tcMar>
+          </w:tcPr>
+          <w:p>
+            <w:pPr>
+              <w:jc w:val="left"/>
+            </w:pPr>
+            <w:r>
+              <w:rPr>
+                <w:rFonts w:ascii="Times New Roman" w:cs="Times New Roman" w:eastAsia="Times New Roman" w:hAnsi="Times New Roman"/>
+                <w:sz w:val="18"/>
+                <w:szCs w:val="18"/>
+              </w:rPr>
+              <w:t xml:space="preserve">1.0</w:t>
+            </w:r>
+          </w:p>
+        </w:tc>
+        <w:tc>
+          <w:tcPr>
+            <w:tcW w:type="dxa" w:w="1900"/>
+            <w:tcBorders>
+              <w:top w:val="single" w:color="999999" w:sz="2"/>
+              <w:left w:val="single" w:color="999999" w:sz="2"/>
+              <w:bottom w:val="single" w:color="999999" w:sz="2"/>
+              <w:right w:val="single" w:color="999999" w:sz="2"/>
+            </w:tcBorders>
+            <w:tcMar>
+              <w:top w:type="dxa" w:w="60"/>
+              <w:left w:type="dxa" w:w="100"/>
+              <w:bottom w:type="dxa" w:w="60"/>
+              <w:right w:type="dxa" w:w="100"/>
+            </w:tcMar>
+          </w:tcPr>
+          <w:p>
+            <w:pPr>
+              <w:jc w:val="left"/>
+            </w:pPr>
+            <w:r>
+              <w:rPr>
+                <w:rFonts w:ascii="Times New Roman" w:cs="Times New Roman" w:eastAsia="Times New Roman" w:hAnsi="Times New Roman"/>
+                <w:sz w:val="18"/>
+                <w:szCs w:val="18"/>
+              </w:rPr>
+              <w:t xml:space="preserve">3.0 m/s (10.8 km/h)</w:t>
+            </w:r>
+          </w:p>
+        </w:tc>
+        <w:tc>
+          <w:tcPr>
+            <w:tcW w:type="dxa" w:w="1724"/>
+            <w:tcBorders>
+              <w:top w:val="single" w:color="999999" w:sz="2"/>
+              <w:left w:val="single" w:color="999999" w:sz="2"/>
+              <w:bottom w:val="single" w:color="999999" w:sz="2"/>
+              <w:right w:val="single" w:color="999999" w:sz="2"/>
+            </w:tcBorders>
+            <w:tcMar>
+              <w:top w:type="dxa" w:w="60"/>
+              <w:left w:type="dxa" w:w="100"/>
+              <w:bottom w:type="dxa" w:w="60"/>
+              <w:right w:type="dxa" w:w="100"/>
+            </w:tcMar>
+          </w:tcPr>
+          <w:p>
+            <w:pPr>
+              <w:jc w:val="left"/>
+            </w:pPr>
+            <w:r>
+              <w:rPr>
+                <w:rFonts w:ascii="Times New Roman" w:cs="Times New Roman" w:eastAsia="Times New Roman" w:hAnsi="Times New Roman"/>
+                <w:sz w:val="18"/>
+                <w:szCs w:val="18"/>
+              </w:rPr>
+              <w:t xml:space="preserve">Full racing speed</w:t>
+            </w:r>
+          </w:p>
+        </w:tc>
+      </w:tr>
+      <w:tr>
+        <w:tc>
+          <w:tcPr>
+            <w:tcW w:type="dxa" w:w="1200"/>
+            <w:tcBorders>
+              <w:top w:val="single" w:color="999999" w:sz="2"/>
+              <w:left w:val="single" w:color="999999" w:sz="2"/>
+              <w:bottom w:val="single" w:color="999999" w:sz="2"/>
+              <w:right w:val="single" w:color="999999" w:sz="2"/>
+            </w:tcBorders>
+            <w:tcMar>
+              <w:top w:type="dxa" w:w="60"/>
+              <w:left w:type="dxa" w:w="100"/>
+              <w:bottom w:type="dxa" w:w="60"/>
+              <w:right w:type="dxa" w:w="100"/>
+            </w:tcMar>
+          </w:tcPr>
+          <w:p>
+            <w:pPr>
+              <w:jc w:val="left"/>
+            </w:pPr>
+            <w:r>
+              <w:rPr>
+                <w:rFonts w:ascii="Times New Roman" w:cs="Times New Roman" w:eastAsia="Times New Roman" w:hAnsi="Times New Roman"/>
+                <w:sz w:val="18"/>
+                <w:szCs w:val="18"/>
+              </w:rPr>
+              <w:t xml:space="preserve">1.5</w:t>
+            </w:r>
+          </w:p>
+        </w:tc>
+        <w:tc>
+          <w:tcPr>
+            <w:tcW w:type="dxa" w:w="1900"/>
+            <w:tcBorders>
+              <w:top w:val="single" w:color="999999" w:sz="2"/>
+              <w:left w:val="single" w:color="999999" w:sz="2"/>
+              <w:bottom w:val="single" w:color="999999" w:sz="2"/>
+              <w:right w:val="single" w:color="999999" w:sz="2"/>
+            </w:tcBorders>
+            <w:tcMar>
+              <w:top w:type="dxa" w:w="60"/>
+              <w:left w:type="dxa" w:w="100"/>
+              <w:bottom w:type="dxa" w:w="60"/>
+              <w:right w:type="dxa" w:w="100"/>
+            </w:tcMar>
+          </w:tcPr>
+          <w:p>
+            <w:pPr>
+              <w:jc w:val="left"/>
+            </w:pPr>
+            <w:r>
+              <w:rPr>
+                <w:rFonts w:ascii="Times New Roman" w:cs="Times New Roman" w:eastAsia="Times New Roman" w:hAnsi="Times New Roman"/>
+                <w:sz w:val="18"/>
+                <w:szCs w:val="18"/>
+              </w:rPr>
+              <w:t xml:space="preserve">4.5 m/s (16.2 km/h)</w:t>
+            </w:r>
+          </w:p>
+        </w:tc>
+        <w:tc>
+          <w:tcPr>
+            <w:tcW w:type="dxa" w:w="1724"/>
+            <w:tcBorders>
+              <w:top w:val="single" w:color="999999" w:sz="2"/>
+              <w:left w:val="single" w:color="999999" w:sz="2"/>
+              <w:bottom w:val="single" w:color="999999" w:sz="2"/>
+              <w:right w:val="single" w:color="999999" w:sz="2"/>
+            </w:tcBorders>
+            <w:tcMar>
+              <w:top w:type="dxa" w:w="60"/>
+              <w:left w:type="dxa" w:w="100"/>
+              <w:bottom w:type="dxa" w:w="60"/>
+              <w:right w:type="dxa" w:w="100"/>
+            </w:tcMar>
+          </w:tcPr>
+          <w:p>
+            <w:pPr>
+              <w:jc w:val="left"/>
+            </w:pPr>
+            <w:r>
+              <w:rPr>
+                <w:rFonts w:ascii="Times New Roman" w:cs="Times New Roman" w:eastAsia="Times New Roman" w:hAnsi="Times New Roman"/>
+                <w:sz w:val="18"/>
+                <w:szCs w:val="18"/>
+              </w:rPr>
+              <w:t xml:space="preserve">Max, clamped by safety limit</w:t>
+            </w:r>
+          </w:p>
+        </w:tc>
+      </w:tr>
+    </w:tbl>
+    <w:p>
+      <w:pPr>
+        <w:spacing w:after="200" w:before="80"/>
+        <w:jc w:val="center"/>
+      </w:pPr>
+      <w:r>
+        <w:rPr>
+          <w:rFonts w:ascii="Times New Roman" w:cs="Times New Roman" w:eastAsia="Times New Roman" w:hAnsi="Times New Roman"/>
+          <w:i/>
+          <w:iCs/>
+          <w:sz w:val="18"/>
+          <w:szCs w:val="18"/>
+        </w:rPr>
+        <w:t xml:space="preserve">TABLE III. SPEED_SCALE TO REAL-WORLD VELOCITY</w:t>
+      </w:r>
+    </w:p>
+    <w:p>
+      <w:pPr>
+        <w:spacing w:after="40" w:before="160"/>
+        <w:jc w:val="center"/>
+      </w:pPr>
+      <w:r>
+        <w:drawing>
+          <wp:inline distT="0" distB="0" distL="0" distR="0">
+            <wp:extent cx="2743200" cy="1959429"/>
+            <wp:effectExtent t="0" r="0" b="0" l="0"/>
+            <wp:docPr id="1" name="Speed scale to real-world velocity" descr="Speed scale to real-world velocity" title="Speed scale to real-world velocity"/>
+            <wp:cNvGraphicFramePr>
+              <a:graphicFrameLocks xmlns:a="http://schemas.openxmlformats.org/drawingml/2006/main" noChangeAspect="1"/>
+            </wp:cNvGraphicFramePr>
+            <a:graphic xmlns:a="http://schemas.openxmlformats.org/drawingml/2006/main">
+              <a:graphicData uri="http://schemas.openxmlformats.org/drawingml/2006/picture">
+                <pic:pic xmlns:pic="http://schemas.openxmlformats.org/drawingml/2006/picture">
+                  <pic:nvPicPr>
+                    <pic:cNvPr id="0" name="" descr=""/>
+                    <pic:cNvPicPr>
+                      <a:picLocks noChangeAspect="1" noChangeArrowheads="1"/>
+                    </pic:cNvPicPr>
+                  </pic:nvPicPr>
+                  <pic:blipFill>
+                    <a:blip r:embed="rId20" cstate="none"/>
+                    <a:srcRect/>
+                    <a:stretch>
+                      <a:fillRect/>
+                    </a:stretch>
+                  </pic:blipFill>
+                  <pic:spPr bwMode="auto">
+                    <a:xfrm>
+                      <a:off x="0" y="0"/>
+                      <a:ext cx="2743200" cy="1959429"/>
+                    </a:xfrm>
+                    <a:prstGeom prst="rect">
+                      <a:avLst/>
+                    </a:prstGeom>
+                  </pic:spPr>
+                </pic:pic>
+              </a:graphicData>
+            </a:graphic>
+          </wp:inline>
+        </w:drawing>
+      </w:r>
+    </w:p>
+    <w:p>
+      <w:pPr>
+        <w:spacing w:after="200" w:before="80"/>
+        <w:jc w:val="center"/>
+      </w:pPr>
+      <w:r>
+        <w:rPr>
+          <w:rFonts w:ascii="Times New Roman" w:cs="Times New Roman" w:eastAsia="Times New Roman" w:hAnsi="Times New Roman"/>
+          <w:i/>
+          <w:iCs/>
+          <w:sz w:val="18"/>
+          <w:szCs w:val="18"/>
+        </w:rPr>
+        <w:t xml:space="preserve">Fig. 12. Straight-line speed reached at each pure_pursuit.speed_scale setting, colored by recommended operating regime from first laps (green) to the clamped safety maximum (red).</w:t>
+      </w:r>
+    </w:p>
+    <w:p>
+      <w:pPr>
+        <w:spacing w:after="120" w:line="264"/>
+        <w:jc w:val="both"/>
+      </w:pPr>
+      <w:r>
+        <w:rPr>
+          <w:rFonts w:ascii="Times New Roman" w:cs="Times New Roman" w:eastAsia="Times New Roman" w:hAnsi="Times New Roman"/>
+          <w:sz w:val="20"/>
+          <w:szCs w:val="20"/>
+        </w:rPr>
+        <w:t xml:space="preserve">When rqt_reconfigure is open during a live session, the use_sim_time checkbox must never be toggled while tuning, as doing so desynchronizes the controller's time source from the rest of the stack; only pure_pursuit.speed_scale, pure_pursuit.lookahead_distance, and pure_pursuit.lookahead_gain should be adjusted through the GUI. The equivalent, safer alternative used throughout development is the CLI form shown above (ros2 param set ...), issued from a separate terminal.</w:t>
       </w:r>
     </w:p>
     <w:p>

</xml_diff>